<commit_message>
Consolidate project specification, four-week review and flexible milestone plan
Integrate the latest Modules A/B/C working design, confirmed Bloomberg access, public-data feasibility audit and downloader. Preserve instrument approval gates and align documentation, source files and configuration.

Record four completed weeks and a capacity-aware 8-10 week forward estimate, with methodology freeze before holdout inspection. Remove redundant documentation and root Word copies; keep data, local readings and Word lock files out of Git.
</commit_message>
<xml_diff>
--- a/docs/source/project_bible_original.docx
+++ b/docs/source/project_bible_original.docx
@@ -1,6 +1,6 @@
 
 <file path=word/document.xml><?xml version="1.0" encoding="utf-8"?>
-<w:document xmlns:wpc="http://schemas.microsoft.com/office/word/2010/wordprocessingCanvas" xmlns:cx="http://schemas.microsoft.com/office/drawing/2014/chartex" xmlns:cx1="http://schemas.microsoft.com/office/drawing/2015/9/8/chartex" xmlns:cx2="http://schemas.microsoft.com/office/drawing/2015/10/21/chartex" xmlns:cx3="http://schemas.microsoft.com/office/drawing/2016/5/9/chartex" xmlns:cx4="http://schemas.microsoft.com/office/drawing/2016/5/10/chartex" xmlns:cx5="http://schemas.microsoft.com/office/drawing/2016/5/11/chartex" xmlns:cx6="http://schemas.microsoft.com/office/drawing/2016/5/12/chartex" xmlns:cx7="http://schemas.microsoft.com/office/drawing/2016/5/13/chartex" xmlns:cx8="http://schemas.microsoft.com/office/drawing/2016/5/14/chartex" xmlns:mc="http://schemas.openxmlformats.org/markup-compatibility/2006" xmlns:m="http://schemas.openxmlformats.org/officeDocument/2006/math" xmlns:aink="http://schemas.microsoft.com/office/drawing/2016/ink" xmlns:am3d="http://schemas.microsoft.com/office/drawing/2017/model3d" xmlns:oel="http://schemas.microsoft.com/office/2019/extlst" xmlns:r="http://schemas.openxmlformats.org/officeDocument/2006/relationships" xmlns:wp14="http://schemas.microsoft.com/office/word/2010/wordprocessingDrawing" xmlns:wp="http://schemas.openxmlformats.org/drawingml/2006/wordprocessingDrawing" xmlns:wpg="http://schemas.microsoft.com/office/word/2010/wordprocessingGroup" xmlns:wpi="http://schemas.microsoft.com/office/word/2010/wordprocessingInk" xmlns:wps="http://schemas.microsoft.com/office/word/2010/wordprocessingShape" xmlns:o="urn:schemas-microsoft-com:office:office" xmlns:v="urn:schemas-microsoft-com:vml" xmlns:w10="urn:schemas-microsoft-com:office:word" xmlns:w="http://schemas.openxmlformats.org/wordprocessingml/2006/main" xmlns:w14="http://schemas.microsoft.com/office/word/2010/wordml" xmlns:w15="http://schemas.microsoft.com/office/word/2012/wordml" xmlns:w16cex="http://schemas.microsoft.com/office/word/2018/wordml/cex" xmlns:w16cid="http://schemas.microsoft.com/office/word/2016/wordml/cid" xmlns:w16="http://schemas.microsoft.com/office/word/2018/wordml" xmlns:w16sdtdh="http://schemas.microsoft.com/office/word/2020/wordml/sdtdatahash" xmlns:w16sdtfl="http://schemas.microsoft.com/office/word/2024/wordml/sdtformatlock" xmlns:w16se="http://schemas.microsoft.com/office/word/2015/wordml/symex" xmlns:w16du="http://schemas.microsoft.com/office/word/2023/wordml/word16du" xmlns:wne="http://schemas.microsoft.com/office/word/2006/wordml" mc:Ignorable="w14 w15 w16se w16cid w16 w16cex w16sdtdh w16sdtfl w16du wp14">
+<w:document xmlns:wpc="http://schemas.microsoft.com/office/word/2010/wordprocessingCanvas" xmlns:cx="http://schemas.microsoft.com/office/drawing/2014/chartex" xmlns:cx1="http://schemas.microsoft.com/office/drawing/2015/9/8/chartex" xmlns:cx2="http://schemas.microsoft.com/office/drawing/2015/10/21/chartex" xmlns:cx3="http://schemas.microsoft.com/office/drawing/2016/5/9/chartex" xmlns:cx4="http://schemas.microsoft.com/office/drawing/2016/5/10/chartex" xmlns:cx5="http://schemas.microsoft.com/office/drawing/2016/5/11/chartex" xmlns:cx6="http://schemas.microsoft.com/office/drawing/2016/5/12/chartex" xmlns:cx7="http://schemas.microsoft.com/office/drawing/2016/5/13/chartex" xmlns:cx8="http://schemas.microsoft.com/office/drawing/2016/5/14/chartex" xmlns:mc="http://schemas.openxmlformats.org/markup-compatibility/2006" xmlns:m="http://schemas.openxmlformats.org/officeDocument/2006/math" xmlns:aink="http://schemas.microsoft.com/office/drawing/2016/ink" xmlns:am3d="http://schemas.microsoft.com/office/drawing/2017/model3d" xmlns:oel="http://schemas.microsoft.com/office/2019/extlst" xmlns:r="http://schemas.openxmlformats.org/officeDocument/2006/relationships" xmlns:wp14="http://schemas.microsoft.com/office/word/2010/wordprocessingDrawing" xmlns:wp="http://schemas.openxmlformats.org/drawingml/2006/wordprocessingDrawing" xmlns:wpg="http://schemas.microsoft.com/office/word/2010/wordprocessingGroup" xmlns:wpi="http://schemas.microsoft.com/office/word/2010/wordprocessingInk" xmlns:wps="http://schemas.microsoft.com/office/word/2010/wordprocessingShape" xmlns:o="urn:schemas-microsoft-com:office:office" xmlns:v="urn:schemas-microsoft-com:vml" xmlns:w10="urn:schemas-microsoft-com:office:word" xmlns:w="http://schemas.openxmlformats.org/wordprocessingml/2006/main" xmlns:w14="http://schemas.microsoft.com/office/word/2010/wordml" xmlns:w15="http://schemas.microsoft.com/office/word/2012/wordml" xmlns:w16cei="http://schemas.microsoft.com/office/word/2026/wordml/cei" xmlns:w16cex="http://schemas.microsoft.com/office/word/2018/wordml/cex" xmlns:w16cid="http://schemas.microsoft.com/office/word/2016/wordml/cid" xmlns:w16="http://schemas.microsoft.com/office/word/2018/wordml" xmlns:w16sdtdh="http://schemas.microsoft.com/office/word/2020/wordml/sdtdatahash" xmlns:w16sdtfl="http://schemas.microsoft.com/office/word/2024/wordml/sdtformatlock" xmlns:w16se="http://schemas.microsoft.com/office/word/2015/wordml/symex" xmlns:w16du="http://schemas.microsoft.com/office/word/2023/wordml/word16du" xmlns:wne="http://schemas.microsoft.com/office/word/2006/wordml" mc:Ignorable="w14 w15 w16se w16cid w16 w16cex w16sdtdh w16sdtfl w16du wp14">
   <w:body>
     <w:p>
       <w:pPr>
@@ -5904,9 +5904,15 @@
           <w:p>
             <w:pPr>
               <w:spacing w:after="0" w:line="240" w:lineRule="auto"/>
-            </w:pPr>
-            <w:r>
-              <w:rPr>
+              <w:rPr>
+                <w:b/>
+                <w:bCs/>
+              </w:rPr>
+            </w:pPr>
+            <w:r>
+              <w:rPr>
+                <w:b/>
+                <w:bCs/>
                 <w:sz w:val="15"/>
               </w:rPr>
               <w:t>Fama - Forward and Spot Exchange Rates</w:t>
@@ -6001,9 +6007,15 @@
           <w:p>
             <w:pPr>
               <w:spacing w:after="0" w:line="240" w:lineRule="auto"/>
-            </w:pPr>
-            <w:r>
-              <w:rPr>
+              <w:rPr>
+                <w:b/>
+                <w:bCs/>
+              </w:rPr>
+            </w:pPr>
+            <w:r>
+              <w:rPr>
+                <w:b/>
+                <w:bCs/>
                 <w:sz w:val="15"/>
               </w:rPr>
               <w:t>Menkhoff et al. - Currency Momentum Strategies</w:t>
@@ -6098,9 +6110,15 @@
           <w:p>
             <w:pPr>
               <w:spacing w:after="0" w:line="240" w:lineRule="auto"/>
-            </w:pPr>
-            <w:r>
-              <w:rPr>
+              <w:rPr>
+                <w:b/>
+                <w:bCs/>
+              </w:rPr>
+            </w:pPr>
+            <w:r>
+              <w:rPr>
+                <w:b/>
+                <w:bCs/>
                 <w:sz w:val="15"/>
               </w:rPr>
               <w:t>Lustig, Roussanov and Verdelhan - Common Risk Factors in Currency Markets</w:t>
@@ -6195,9 +6213,15 @@
           <w:p>
             <w:pPr>
               <w:spacing w:after="0" w:line="240" w:lineRule="auto"/>
-            </w:pPr>
-            <w:r>
-              <w:rPr>
+              <w:rPr>
+                <w:b/>
+                <w:bCs/>
+              </w:rPr>
+            </w:pPr>
+            <w:r>
+              <w:rPr>
+                <w:b/>
+                <w:bCs/>
                 <w:sz w:val="15"/>
               </w:rPr>
               <w:t>Cochrane and Piazzesi - Bond Risk Premia</w:t>
@@ -6292,9 +6316,15 @@
           <w:p>
             <w:pPr>
               <w:spacing w:after="0" w:line="240" w:lineRule="auto"/>
-            </w:pPr>
-            <w:r>
-              <w:rPr>
+              <w:rPr>
+                <w:b/>
+                <w:bCs/>
+              </w:rPr>
+            </w:pPr>
+            <w:r>
+              <w:rPr>
+                <w:b/>
+                <w:bCs/>
                 <w:sz w:val="15"/>
               </w:rPr>
               <w:t>Bailey et al. - Probability of Backtest Overfitting</w:t>
@@ -26899,7 +26929,7 @@
 </file>
 
 <file path=word/endnotes.xml><?xml version="1.0" encoding="utf-8"?>
-<w:endnotes xmlns:wpc="http://schemas.microsoft.com/office/word/2010/wordprocessingCanvas" xmlns:cx="http://schemas.microsoft.com/office/drawing/2014/chartex" xmlns:cx1="http://schemas.microsoft.com/office/drawing/2015/9/8/chartex" xmlns:cx2="http://schemas.microsoft.com/office/drawing/2015/10/21/chartex" xmlns:cx3="http://schemas.microsoft.com/office/drawing/2016/5/9/chartex" xmlns:cx4="http://schemas.microsoft.com/office/drawing/2016/5/10/chartex" xmlns:cx5="http://schemas.microsoft.com/office/drawing/2016/5/11/chartex" xmlns:cx6="http://schemas.microsoft.com/office/drawing/2016/5/12/chartex" xmlns:cx7="http://schemas.microsoft.com/office/drawing/2016/5/13/chartex" xmlns:cx8="http://schemas.microsoft.com/office/drawing/2016/5/14/chartex" xmlns:mc="http://schemas.openxmlformats.org/markup-compatibility/2006" xmlns:m="http://schemas.openxmlformats.org/officeDocument/2006/math" xmlns:aink="http://schemas.microsoft.com/office/drawing/2016/ink" xmlns:am3d="http://schemas.microsoft.com/office/drawing/2017/model3d" xmlns:oel="http://schemas.microsoft.com/office/2019/extlst" xmlns:r="http://schemas.openxmlformats.org/officeDocument/2006/relationships" xmlns:wp14="http://schemas.microsoft.com/office/word/2010/wordprocessingDrawing" xmlns:wp="http://schemas.openxmlformats.org/drawingml/2006/wordprocessingDrawing" xmlns:wpg="http://schemas.microsoft.com/office/word/2010/wordprocessingGroup" xmlns:wpi="http://schemas.microsoft.com/office/word/2010/wordprocessingInk" xmlns:wps="http://schemas.microsoft.com/office/word/2010/wordprocessingShape" xmlns:o="urn:schemas-microsoft-com:office:office" xmlns:v="urn:schemas-microsoft-com:vml" xmlns:w10="urn:schemas-microsoft-com:office:word" xmlns:w="http://schemas.openxmlformats.org/wordprocessingml/2006/main" xmlns:w14="http://schemas.microsoft.com/office/word/2010/wordml" xmlns:w15="http://schemas.microsoft.com/office/word/2012/wordml" xmlns:w16cex="http://schemas.microsoft.com/office/word/2018/wordml/cex" xmlns:w16cid="http://schemas.microsoft.com/office/word/2016/wordml/cid" xmlns:w16="http://schemas.microsoft.com/office/word/2018/wordml" xmlns:w16sdtdh="http://schemas.microsoft.com/office/word/2020/wordml/sdtdatahash" xmlns:w16sdtfl="http://schemas.microsoft.com/office/word/2024/wordml/sdtformatlock" xmlns:w16se="http://schemas.microsoft.com/office/word/2015/wordml/symex" xmlns:w16du="http://schemas.microsoft.com/office/word/2023/wordml/word16du" xmlns:wne="http://schemas.microsoft.com/office/word/2006/wordml" mc:Ignorable="w14 w15 w16se w16cid w16 w16cex w16sdtdh w16sdtfl w16du wp14">
+<w:endnotes xmlns:wpc="http://schemas.microsoft.com/office/word/2010/wordprocessingCanvas" xmlns:cx="http://schemas.microsoft.com/office/drawing/2014/chartex" xmlns:cx1="http://schemas.microsoft.com/office/drawing/2015/9/8/chartex" xmlns:cx2="http://schemas.microsoft.com/office/drawing/2015/10/21/chartex" xmlns:cx3="http://schemas.microsoft.com/office/drawing/2016/5/9/chartex" xmlns:cx4="http://schemas.microsoft.com/office/drawing/2016/5/10/chartex" xmlns:cx5="http://schemas.microsoft.com/office/drawing/2016/5/11/chartex" xmlns:cx6="http://schemas.microsoft.com/office/drawing/2016/5/12/chartex" xmlns:cx7="http://schemas.microsoft.com/office/drawing/2016/5/13/chartex" xmlns:cx8="http://schemas.microsoft.com/office/drawing/2016/5/14/chartex" xmlns:mc="http://schemas.openxmlformats.org/markup-compatibility/2006" xmlns:m="http://schemas.openxmlformats.org/officeDocument/2006/math" xmlns:aink="http://schemas.microsoft.com/office/drawing/2016/ink" xmlns:am3d="http://schemas.microsoft.com/office/drawing/2017/model3d" xmlns:oel="http://schemas.microsoft.com/office/2019/extlst" xmlns:r="http://schemas.openxmlformats.org/officeDocument/2006/relationships" xmlns:wp14="http://schemas.microsoft.com/office/word/2010/wordprocessingDrawing" xmlns:wp="http://schemas.openxmlformats.org/drawingml/2006/wordprocessingDrawing" xmlns:wpg="http://schemas.microsoft.com/office/word/2010/wordprocessingGroup" xmlns:wpi="http://schemas.microsoft.com/office/word/2010/wordprocessingInk" xmlns:wps="http://schemas.microsoft.com/office/word/2010/wordprocessingShape" xmlns:o="urn:schemas-microsoft-com:office:office" xmlns:v="urn:schemas-microsoft-com:vml" xmlns:w10="urn:schemas-microsoft-com:office:word" xmlns:w="http://schemas.openxmlformats.org/wordprocessingml/2006/main" xmlns:w14="http://schemas.microsoft.com/office/word/2010/wordml" xmlns:w15="http://schemas.microsoft.com/office/word/2012/wordml" xmlns:w16cei="http://schemas.microsoft.com/office/word/2026/wordml/cei" xmlns:w16cex="http://schemas.microsoft.com/office/word/2018/wordml/cex" xmlns:w16cid="http://schemas.microsoft.com/office/word/2016/wordml/cid" xmlns:w16="http://schemas.microsoft.com/office/word/2018/wordml" xmlns:w16sdtdh="http://schemas.microsoft.com/office/word/2020/wordml/sdtdatahash" xmlns:w16sdtfl="http://schemas.microsoft.com/office/word/2024/wordml/sdtformatlock" xmlns:w16se="http://schemas.microsoft.com/office/word/2015/wordml/symex" xmlns:w16du="http://schemas.microsoft.com/office/word/2023/wordml/word16du" xmlns:wne="http://schemas.microsoft.com/office/word/2006/wordml" mc:Ignorable="w14 w15 w16se w16cid w16 w16cex w16sdtdh w16sdtfl w16du wp14">
   <w:endnote w:type="separator" w:id="-1">
     <w:p>
       <w:pPr>
@@ -26924,7 +26954,7 @@
 </file>
 
 <file path=word/footer1.xml><?xml version="1.0" encoding="utf-8"?>
-<w:ftr xmlns:wpc="http://schemas.microsoft.com/office/word/2010/wordprocessingCanvas" xmlns:cx="http://schemas.microsoft.com/office/drawing/2014/chartex" xmlns:cx1="http://schemas.microsoft.com/office/drawing/2015/9/8/chartex" xmlns:cx2="http://schemas.microsoft.com/office/drawing/2015/10/21/chartex" xmlns:cx3="http://schemas.microsoft.com/office/drawing/2016/5/9/chartex" xmlns:cx4="http://schemas.microsoft.com/office/drawing/2016/5/10/chartex" xmlns:cx5="http://schemas.microsoft.com/office/drawing/2016/5/11/chartex" xmlns:cx6="http://schemas.microsoft.com/office/drawing/2016/5/12/chartex" xmlns:cx7="http://schemas.microsoft.com/office/drawing/2016/5/13/chartex" xmlns:cx8="http://schemas.microsoft.com/office/drawing/2016/5/14/chartex" xmlns:mc="http://schemas.openxmlformats.org/markup-compatibility/2006" xmlns:m="http://schemas.openxmlformats.org/officeDocument/2006/math" xmlns:aink="http://schemas.microsoft.com/office/drawing/2016/ink" xmlns:am3d="http://schemas.microsoft.com/office/drawing/2017/model3d" xmlns:oel="http://schemas.microsoft.com/office/2019/extlst" xmlns:r="http://schemas.openxmlformats.org/officeDocument/2006/relationships" xmlns:wp14="http://schemas.microsoft.com/office/word/2010/wordprocessingDrawing" xmlns:wp="http://schemas.openxmlformats.org/drawingml/2006/wordprocessingDrawing" xmlns:wpg="http://schemas.microsoft.com/office/word/2010/wordprocessingGroup" xmlns:wpi="http://schemas.microsoft.com/office/word/2010/wordprocessingInk" xmlns:wps="http://schemas.microsoft.com/office/word/2010/wordprocessingShape" xmlns:o="urn:schemas-microsoft-com:office:office" xmlns:v="urn:schemas-microsoft-com:vml" xmlns:w10="urn:schemas-microsoft-com:office:word" xmlns:w="http://schemas.openxmlformats.org/wordprocessingml/2006/main" xmlns:w14="http://schemas.microsoft.com/office/word/2010/wordml" xmlns:w15="http://schemas.microsoft.com/office/word/2012/wordml" xmlns:w16cex="http://schemas.microsoft.com/office/word/2018/wordml/cex" xmlns:w16cid="http://schemas.microsoft.com/office/word/2016/wordml/cid" xmlns:w16="http://schemas.microsoft.com/office/word/2018/wordml" xmlns:w16sdtdh="http://schemas.microsoft.com/office/word/2020/wordml/sdtdatahash" xmlns:w16sdtfl="http://schemas.microsoft.com/office/word/2024/wordml/sdtformatlock" xmlns:w16se="http://schemas.microsoft.com/office/word/2015/wordml/symex" xmlns:w16du="http://schemas.microsoft.com/office/word/2023/wordml/word16du" xmlns:wne="http://schemas.microsoft.com/office/word/2006/wordml" mc:Ignorable="w14 w15 w16se w16cid w16 w16cex w16sdtdh w16sdtfl w16du wp14">
+<w:ftr xmlns:wpc="http://schemas.microsoft.com/office/word/2010/wordprocessingCanvas" xmlns:cx="http://schemas.microsoft.com/office/drawing/2014/chartex" xmlns:cx1="http://schemas.microsoft.com/office/drawing/2015/9/8/chartex" xmlns:cx2="http://schemas.microsoft.com/office/drawing/2015/10/21/chartex" xmlns:cx3="http://schemas.microsoft.com/office/drawing/2016/5/9/chartex" xmlns:cx4="http://schemas.microsoft.com/office/drawing/2016/5/10/chartex" xmlns:cx5="http://schemas.microsoft.com/office/drawing/2016/5/11/chartex" xmlns:cx6="http://schemas.microsoft.com/office/drawing/2016/5/12/chartex" xmlns:cx7="http://schemas.microsoft.com/office/drawing/2016/5/13/chartex" xmlns:cx8="http://schemas.microsoft.com/office/drawing/2016/5/14/chartex" xmlns:mc="http://schemas.openxmlformats.org/markup-compatibility/2006" xmlns:m="http://schemas.openxmlformats.org/officeDocument/2006/math" xmlns:aink="http://schemas.microsoft.com/office/drawing/2016/ink" xmlns:am3d="http://schemas.microsoft.com/office/drawing/2017/model3d" xmlns:oel="http://schemas.microsoft.com/office/2019/extlst" xmlns:r="http://schemas.openxmlformats.org/officeDocument/2006/relationships" xmlns:wp14="http://schemas.microsoft.com/office/word/2010/wordprocessingDrawing" xmlns:wp="http://schemas.openxmlformats.org/drawingml/2006/wordprocessingDrawing" xmlns:wpg="http://schemas.microsoft.com/office/word/2010/wordprocessingGroup" xmlns:wpi="http://schemas.microsoft.com/office/word/2010/wordprocessingInk" xmlns:wps="http://schemas.microsoft.com/office/word/2010/wordprocessingShape" xmlns:o="urn:schemas-microsoft-com:office:office" xmlns:v="urn:schemas-microsoft-com:vml" xmlns:w10="urn:schemas-microsoft-com:office:word" xmlns:w="http://schemas.openxmlformats.org/wordprocessingml/2006/main" xmlns:w14="http://schemas.microsoft.com/office/word/2010/wordml" xmlns:w15="http://schemas.microsoft.com/office/word/2012/wordml" xmlns:w16cei="http://schemas.microsoft.com/office/word/2026/wordml/cei" xmlns:w16cex="http://schemas.microsoft.com/office/word/2018/wordml/cex" xmlns:w16cid="http://schemas.microsoft.com/office/word/2016/wordml/cid" xmlns:w16="http://schemas.microsoft.com/office/word/2018/wordml" xmlns:w16sdtdh="http://schemas.microsoft.com/office/word/2020/wordml/sdtdatahash" xmlns:w16sdtfl="http://schemas.microsoft.com/office/word/2024/wordml/sdtformatlock" xmlns:w16se="http://schemas.microsoft.com/office/word/2015/wordml/symex" xmlns:w16du="http://schemas.microsoft.com/office/word/2023/wordml/word16du" xmlns:wne="http://schemas.microsoft.com/office/word/2006/wordml" mc:Ignorable="w14 w15 w16se w16cid w16 w16cex w16sdtdh w16sdtfl w16du wp14">
   <w:p>
     <w:pPr>
       <w:pStyle w:val="Footer"/>
@@ -26978,7 +27008,7 @@
 </file>
 
 <file path=word/footnotes.xml><?xml version="1.0" encoding="utf-8"?>
-<w:footnotes xmlns:wpc="http://schemas.microsoft.com/office/word/2010/wordprocessingCanvas" xmlns:cx="http://schemas.microsoft.com/office/drawing/2014/chartex" xmlns:cx1="http://schemas.microsoft.com/office/drawing/2015/9/8/chartex" xmlns:cx2="http://schemas.microsoft.com/office/drawing/2015/10/21/chartex" xmlns:cx3="http://schemas.microsoft.com/office/drawing/2016/5/9/chartex" xmlns:cx4="http://schemas.microsoft.com/office/drawing/2016/5/10/chartex" xmlns:cx5="http://schemas.microsoft.com/office/drawing/2016/5/11/chartex" xmlns:cx6="http://schemas.microsoft.com/office/drawing/2016/5/12/chartex" xmlns:cx7="http://schemas.microsoft.com/office/drawing/2016/5/13/chartex" xmlns:cx8="http://schemas.microsoft.com/office/drawing/2016/5/14/chartex" xmlns:mc="http://schemas.openxmlformats.org/markup-compatibility/2006" xmlns:m="http://schemas.openxmlformats.org/officeDocument/2006/math" xmlns:aink="http://schemas.microsoft.com/office/drawing/2016/ink" xmlns:am3d="http://schemas.microsoft.com/office/drawing/2017/model3d" xmlns:oel="http://schemas.microsoft.com/office/2019/extlst" xmlns:r="http://schemas.openxmlformats.org/officeDocument/2006/relationships" xmlns:wp14="http://schemas.microsoft.com/office/word/2010/wordprocessingDrawing" xmlns:wp="http://schemas.openxmlformats.org/drawingml/2006/wordprocessingDrawing" xmlns:wpg="http://schemas.microsoft.com/office/word/2010/wordprocessingGroup" xmlns:wpi="http://schemas.microsoft.com/office/word/2010/wordprocessingInk" xmlns:wps="http://schemas.microsoft.com/office/word/2010/wordprocessingShape" xmlns:o="urn:schemas-microsoft-com:office:office" xmlns:v="urn:schemas-microsoft-com:vml" xmlns:w10="urn:schemas-microsoft-com:office:word" xmlns:w="http://schemas.openxmlformats.org/wordprocessingml/2006/main" xmlns:w14="http://schemas.microsoft.com/office/word/2010/wordml" xmlns:w15="http://schemas.microsoft.com/office/word/2012/wordml" xmlns:w16cex="http://schemas.microsoft.com/office/word/2018/wordml/cex" xmlns:w16cid="http://schemas.microsoft.com/office/word/2016/wordml/cid" xmlns:w16="http://schemas.microsoft.com/office/word/2018/wordml" xmlns:w16sdtdh="http://schemas.microsoft.com/office/word/2020/wordml/sdtdatahash" xmlns:w16sdtfl="http://schemas.microsoft.com/office/word/2024/wordml/sdtformatlock" xmlns:w16se="http://schemas.microsoft.com/office/word/2015/wordml/symex" xmlns:w16du="http://schemas.microsoft.com/office/word/2023/wordml/word16du" xmlns:wne="http://schemas.microsoft.com/office/word/2006/wordml" mc:Ignorable="w14 w15 w16se w16cid w16 w16cex w16sdtdh w16sdtfl w16du wp14">
+<w:footnotes xmlns:wpc="http://schemas.microsoft.com/office/word/2010/wordprocessingCanvas" xmlns:cx="http://schemas.microsoft.com/office/drawing/2014/chartex" xmlns:cx1="http://schemas.microsoft.com/office/drawing/2015/9/8/chartex" xmlns:cx2="http://schemas.microsoft.com/office/drawing/2015/10/21/chartex" xmlns:cx3="http://schemas.microsoft.com/office/drawing/2016/5/9/chartex" xmlns:cx4="http://schemas.microsoft.com/office/drawing/2016/5/10/chartex" xmlns:cx5="http://schemas.microsoft.com/office/drawing/2016/5/11/chartex" xmlns:cx6="http://schemas.microsoft.com/office/drawing/2016/5/12/chartex" xmlns:cx7="http://schemas.microsoft.com/office/drawing/2016/5/13/chartex" xmlns:cx8="http://schemas.microsoft.com/office/drawing/2016/5/14/chartex" xmlns:mc="http://schemas.openxmlformats.org/markup-compatibility/2006" xmlns:m="http://schemas.openxmlformats.org/officeDocument/2006/math" xmlns:aink="http://schemas.microsoft.com/office/drawing/2016/ink" xmlns:am3d="http://schemas.microsoft.com/office/drawing/2017/model3d" xmlns:oel="http://schemas.microsoft.com/office/2019/extlst" xmlns:r="http://schemas.openxmlformats.org/officeDocument/2006/relationships" xmlns:wp14="http://schemas.microsoft.com/office/word/2010/wordprocessingDrawing" xmlns:wp="http://schemas.openxmlformats.org/drawingml/2006/wordprocessingDrawing" xmlns:wpg="http://schemas.microsoft.com/office/word/2010/wordprocessingGroup" xmlns:wpi="http://schemas.microsoft.com/office/word/2010/wordprocessingInk" xmlns:wps="http://schemas.microsoft.com/office/word/2010/wordprocessingShape" xmlns:o="urn:schemas-microsoft-com:office:office" xmlns:v="urn:schemas-microsoft-com:vml" xmlns:w10="urn:schemas-microsoft-com:office:word" xmlns:w="http://schemas.openxmlformats.org/wordprocessingml/2006/main" xmlns:w14="http://schemas.microsoft.com/office/word/2010/wordml" xmlns:w15="http://schemas.microsoft.com/office/word/2012/wordml" xmlns:w16cei="http://schemas.microsoft.com/office/word/2026/wordml/cei" xmlns:w16cex="http://schemas.microsoft.com/office/word/2018/wordml/cex" xmlns:w16cid="http://schemas.microsoft.com/office/word/2016/wordml/cid" xmlns:w16="http://schemas.microsoft.com/office/word/2018/wordml" xmlns:w16sdtdh="http://schemas.microsoft.com/office/word/2020/wordml/sdtdatahash" xmlns:w16sdtfl="http://schemas.microsoft.com/office/word/2024/wordml/sdtformatlock" xmlns:w16se="http://schemas.microsoft.com/office/word/2015/wordml/symex" xmlns:w16du="http://schemas.microsoft.com/office/word/2023/wordml/word16du" xmlns:wne="http://schemas.microsoft.com/office/word/2006/wordml" mc:Ignorable="w14 w15 w16se w16cid w16 w16cex w16sdtdh w16sdtfl w16du wp14">
   <w:footnote w:type="separator" w:id="-1">
     <w:p>
       <w:pPr>
@@ -27003,7 +27033,7 @@
 </file>
 
 <file path=word/header1.xml><?xml version="1.0" encoding="utf-8"?>
-<w:hdr xmlns:wpc="http://schemas.microsoft.com/office/word/2010/wordprocessingCanvas" xmlns:cx="http://schemas.microsoft.com/office/drawing/2014/chartex" xmlns:cx1="http://schemas.microsoft.com/office/drawing/2015/9/8/chartex" xmlns:cx2="http://schemas.microsoft.com/office/drawing/2015/10/21/chartex" xmlns:cx3="http://schemas.microsoft.com/office/drawing/2016/5/9/chartex" xmlns:cx4="http://schemas.microsoft.com/office/drawing/2016/5/10/chartex" xmlns:cx5="http://schemas.microsoft.com/office/drawing/2016/5/11/chartex" xmlns:cx6="http://schemas.microsoft.com/office/drawing/2016/5/12/chartex" xmlns:cx7="http://schemas.microsoft.com/office/drawing/2016/5/13/chartex" xmlns:cx8="http://schemas.microsoft.com/office/drawing/2016/5/14/chartex" xmlns:mc="http://schemas.openxmlformats.org/markup-compatibility/2006" xmlns:m="http://schemas.openxmlformats.org/officeDocument/2006/math" xmlns:aink="http://schemas.microsoft.com/office/drawing/2016/ink" xmlns:am3d="http://schemas.microsoft.com/office/drawing/2017/model3d" xmlns:oel="http://schemas.microsoft.com/office/2019/extlst" xmlns:r="http://schemas.openxmlformats.org/officeDocument/2006/relationships" xmlns:wp14="http://schemas.microsoft.com/office/word/2010/wordprocessingDrawing" xmlns:wp="http://schemas.openxmlformats.org/drawingml/2006/wordprocessingDrawing" xmlns:wpg="http://schemas.microsoft.com/office/word/2010/wordprocessingGroup" xmlns:wpi="http://schemas.microsoft.com/office/word/2010/wordprocessingInk" xmlns:wps="http://schemas.microsoft.com/office/word/2010/wordprocessingShape" xmlns:o="urn:schemas-microsoft-com:office:office" xmlns:v="urn:schemas-microsoft-com:vml" xmlns:w10="urn:schemas-microsoft-com:office:word" xmlns:w="http://schemas.openxmlformats.org/wordprocessingml/2006/main" xmlns:w14="http://schemas.microsoft.com/office/word/2010/wordml" xmlns:w15="http://schemas.microsoft.com/office/word/2012/wordml" xmlns:w16cex="http://schemas.microsoft.com/office/word/2018/wordml/cex" xmlns:w16cid="http://schemas.microsoft.com/office/word/2016/wordml/cid" xmlns:w16="http://schemas.microsoft.com/office/word/2018/wordml" xmlns:w16sdtdh="http://schemas.microsoft.com/office/word/2020/wordml/sdtdatahash" xmlns:w16sdtfl="http://schemas.microsoft.com/office/word/2024/wordml/sdtformatlock" xmlns:w16se="http://schemas.microsoft.com/office/word/2015/wordml/symex" xmlns:w16du="http://schemas.microsoft.com/office/word/2023/wordml/word16du" xmlns:wne="http://schemas.microsoft.com/office/word/2006/wordml" mc:Ignorable="w14 w15 w16se w16cid w16 w16cex w16sdtdh w16sdtfl w16du wp14">
+<w:hdr xmlns:wpc="http://schemas.microsoft.com/office/word/2010/wordprocessingCanvas" xmlns:cx="http://schemas.microsoft.com/office/drawing/2014/chartex" xmlns:cx1="http://schemas.microsoft.com/office/drawing/2015/9/8/chartex" xmlns:cx2="http://schemas.microsoft.com/office/drawing/2015/10/21/chartex" xmlns:cx3="http://schemas.microsoft.com/office/drawing/2016/5/9/chartex" xmlns:cx4="http://schemas.microsoft.com/office/drawing/2016/5/10/chartex" xmlns:cx5="http://schemas.microsoft.com/office/drawing/2016/5/11/chartex" xmlns:cx6="http://schemas.microsoft.com/office/drawing/2016/5/12/chartex" xmlns:cx7="http://schemas.microsoft.com/office/drawing/2016/5/13/chartex" xmlns:cx8="http://schemas.microsoft.com/office/drawing/2016/5/14/chartex" xmlns:mc="http://schemas.openxmlformats.org/markup-compatibility/2006" xmlns:m="http://schemas.openxmlformats.org/officeDocument/2006/math" xmlns:aink="http://schemas.microsoft.com/office/drawing/2016/ink" xmlns:am3d="http://schemas.microsoft.com/office/drawing/2017/model3d" xmlns:oel="http://schemas.microsoft.com/office/2019/extlst" xmlns:r="http://schemas.openxmlformats.org/officeDocument/2006/relationships" xmlns:wp14="http://schemas.microsoft.com/office/word/2010/wordprocessingDrawing" xmlns:wp="http://schemas.openxmlformats.org/drawingml/2006/wordprocessingDrawing" xmlns:wpg="http://schemas.microsoft.com/office/word/2010/wordprocessingGroup" xmlns:wpi="http://schemas.microsoft.com/office/word/2010/wordprocessingInk" xmlns:wps="http://schemas.microsoft.com/office/word/2010/wordprocessingShape" xmlns:o="urn:schemas-microsoft-com:office:office" xmlns:v="urn:schemas-microsoft-com:vml" xmlns:w10="urn:schemas-microsoft-com:office:word" xmlns:w="http://schemas.openxmlformats.org/wordprocessingml/2006/main" xmlns:w14="http://schemas.microsoft.com/office/word/2010/wordml" xmlns:w15="http://schemas.microsoft.com/office/word/2012/wordml" xmlns:w16cei="http://schemas.microsoft.com/office/word/2026/wordml/cei" xmlns:w16cex="http://schemas.microsoft.com/office/word/2018/wordml/cex" xmlns:w16cid="http://schemas.microsoft.com/office/word/2016/wordml/cid" xmlns:w16="http://schemas.microsoft.com/office/word/2018/wordml" xmlns:w16sdtdh="http://schemas.microsoft.com/office/word/2020/wordml/sdtdatahash" xmlns:w16sdtfl="http://schemas.microsoft.com/office/word/2024/wordml/sdtformatlock" xmlns:w16se="http://schemas.microsoft.com/office/word/2015/wordml/symex" xmlns:w16du="http://schemas.microsoft.com/office/word/2023/wordml/word16du" xmlns:wne="http://schemas.microsoft.com/office/word/2006/wordml" mc:Ignorable="w14 w15 w16se w16cid w16 w16cex w16sdtdh w16sdtfl w16du wp14">
   <w:p>
     <w:pPr>
       <w:pStyle w:val="Header"/>
@@ -27024,7 +27054,7 @@
 </file>
 
 <file path=word/numbering.xml><?xml version="1.0" encoding="utf-8"?>
-<w:numbering xmlns:wpc="http://schemas.microsoft.com/office/word/2010/wordprocessingCanvas" xmlns:cx="http://schemas.microsoft.com/office/drawing/2014/chartex" xmlns:cx1="http://schemas.microsoft.com/office/drawing/2015/9/8/chartex" xmlns:cx2="http://schemas.microsoft.com/office/drawing/2015/10/21/chartex" xmlns:cx3="http://schemas.microsoft.com/office/drawing/2016/5/9/chartex" xmlns:cx4="http://schemas.microsoft.com/office/drawing/2016/5/10/chartex" xmlns:cx5="http://schemas.microsoft.com/office/drawing/2016/5/11/chartex" xmlns:cx6="http://schemas.microsoft.com/office/drawing/2016/5/12/chartex" xmlns:cx7="http://schemas.microsoft.com/office/drawing/2016/5/13/chartex" xmlns:cx8="http://schemas.microsoft.com/office/drawing/2016/5/14/chartex" xmlns:mc="http://schemas.openxmlformats.org/markup-compatibility/2006" xmlns:m="http://schemas.openxmlformats.org/officeDocument/2006/math" xmlns:aink="http://schemas.microsoft.com/office/drawing/2016/ink" xmlns:am3d="http://schemas.microsoft.com/office/drawing/2017/model3d" xmlns:oel="http://schemas.microsoft.com/office/2019/extlst" xmlns:r="http://schemas.openxmlformats.org/officeDocument/2006/relationships" xmlns:wp14="http://schemas.microsoft.com/office/word/2010/wordprocessingDrawing" xmlns:wp="http://schemas.openxmlformats.org/drawingml/2006/wordprocessingDrawing" xmlns:wpg="http://schemas.microsoft.com/office/word/2010/wordprocessingGroup" xmlns:wpi="http://schemas.microsoft.com/office/word/2010/wordprocessingInk" xmlns:wps="http://schemas.microsoft.com/office/word/2010/wordprocessingShape" xmlns:o="urn:schemas-microsoft-com:office:office" xmlns:v="urn:schemas-microsoft-com:vml" xmlns:w10="urn:schemas-microsoft-com:office:word" xmlns:w="http://schemas.openxmlformats.org/wordprocessingml/2006/main" xmlns:w14="http://schemas.microsoft.com/office/word/2010/wordml" xmlns:w15="http://schemas.microsoft.com/office/word/2012/wordml" xmlns:w16cex="http://schemas.microsoft.com/office/word/2018/wordml/cex" xmlns:w16cid="http://schemas.microsoft.com/office/word/2016/wordml/cid" xmlns:w16="http://schemas.microsoft.com/office/word/2018/wordml" xmlns:w16sdtdh="http://schemas.microsoft.com/office/word/2020/wordml/sdtdatahash" xmlns:w16sdtfl="http://schemas.microsoft.com/office/word/2024/wordml/sdtformatlock" xmlns:w16se="http://schemas.microsoft.com/office/word/2015/wordml/symex" xmlns:w16du="http://schemas.microsoft.com/office/word/2023/wordml/word16du" xmlns:wne="http://schemas.microsoft.com/office/word/2006/wordml" mc:Ignorable="w14 w15 w16se w16cid w16 w16cex w16sdtdh w16sdtfl w16du wp14">
+<w:numbering xmlns:wpc="http://schemas.microsoft.com/office/word/2010/wordprocessingCanvas" xmlns:cx="http://schemas.microsoft.com/office/drawing/2014/chartex" xmlns:cx1="http://schemas.microsoft.com/office/drawing/2015/9/8/chartex" xmlns:cx2="http://schemas.microsoft.com/office/drawing/2015/10/21/chartex" xmlns:cx3="http://schemas.microsoft.com/office/drawing/2016/5/9/chartex" xmlns:cx4="http://schemas.microsoft.com/office/drawing/2016/5/10/chartex" xmlns:cx5="http://schemas.microsoft.com/office/drawing/2016/5/11/chartex" xmlns:cx6="http://schemas.microsoft.com/office/drawing/2016/5/12/chartex" xmlns:cx7="http://schemas.microsoft.com/office/drawing/2016/5/13/chartex" xmlns:cx8="http://schemas.microsoft.com/office/drawing/2016/5/14/chartex" xmlns:mc="http://schemas.openxmlformats.org/markup-compatibility/2006" xmlns:m="http://schemas.openxmlformats.org/officeDocument/2006/math" xmlns:aink="http://schemas.microsoft.com/office/drawing/2016/ink" xmlns:am3d="http://schemas.microsoft.com/office/drawing/2017/model3d" xmlns:oel="http://schemas.microsoft.com/office/2019/extlst" xmlns:r="http://schemas.openxmlformats.org/officeDocument/2006/relationships" xmlns:wp14="http://schemas.microsoft.com/office/word/2010/wordprocessingDrawing" xmlns:wp="http://schemas.openxmlformats.org/drawingml/2006/wordprocessingDrawing" xmlns:wpg="http://schemas.microsoft.com/office/word/2010/wordprocessingGroup" xmlns:wpi="http://schemas.microsoft.com/office/word/2010/wordprocessingInk" xmlns:wps="http://schemas.microsoft.com/office/word/2010/wordprocessingShape" xmlns:o="urn:schemas-microsoft-com:office:office" xmlns:v="urn:schemas-microsoft-com:vml" xmlns:w10="urn:schemas-microsoft-com:office:word" xmlns:w="http://schemas.openxmlformats.org/wordprocessingml/2006/main" xmlns:w14="http://schemas.microsoft.com/office/word/2010/wordml" xmlns:w15="http://schemas.microsoft.com/office/word/2012/wordml" xmlns:w16cei="http://schemas.microsoft.com/office/word/2026/wordml/cei" xmlns:w16cex="http://schemas.microsoft.com/office/word/2018/wordml/cex" xmlns:w16cid="http://schemas.microsoft.com/office/word/2016/wordml/cid" xmlns:w16="http://schemas.microsoft.com/office/word/2018/wordml" xmlns:w16sdtdh="http://schemas.microsoft.com/office/word/2020/wordml/sdtdatahash" xmlns:w16sdtfl="http://schemas.microsoft.com/office/word/2024/wordml/sdtformatlock" xmlns:w16se="http://schemas.microsoft.com/office/word/2015/wordml/symex" xmlns:w16du="http://schemas.microsoft.com/office/word/2023/wordml/word16du" xmlns:wne="http://schemas.microsoft.com/office/word/2006/wordml" mc:Ignorable="w14 w15 w16se w16cid w16 w16cex w16sdtdh w16sdtfl w16du wp14">
   <w:abstractNum w:abstractNumId="0" w15:restartNumberingAfterBreak="0">
     <w:nsid w:val="FFFFFF7C"/>
     <w:multiLevelType w:val="singleLevel"/>
@@ -27178,7 +27208,7 @@
   <w:abstractNum w:abstractNumId="8" w15:restartNumberingAfterBreak="0">
     <w:nsid w:val="FFFFFF89"/>
     <w:multiLevelType w:val="singleLevel"/>
-    <w:tmpl w:val="29761A62"/>
+    <w:tmpl w:val="E1FC05C8"/>
     <w:lvl w:ilvl="0">
       <w:start w:val="1"/>
       <w:numFmt w:val="bullet"/>

</xml_diff>